<commit_message>
atualização do back e do modelo de relatorio
</commit_message>
<xml_diff>
--- a/modelos/tecnica/ModeloTec - Relatório de Acompanhamento de Projeto.docx
+++ b/modelos/tecnica/ModeloTec - Relatório de Acompanhamento de Projeto.docx
@@ -1751,25 +1751,7 @@
                 <w:sz w:val="24"/>
                 <w:szCs w:val="24"/>
               </w:rPr>
-              <w:t>[</w:t>
-            </w:r>
-            <w:proofErr w:type="gramStart"/>
-            <w:r>
-              <w:rPr>
-                <w:rFonts w:ascii="Calibri" w:eastAsia="Calibri" w:hAnsi="Calibri" w:cs="Calibri"/>
-                <w:sz w:val="24"/>
-                <w:szCs w:val="24"/>
-              </w:rPr>
-              <w:t>TITULO</w:t>
-            </w:r>
-            <w:proofErr w:type="gramEnd"/>
-            <w:r>
-              <w:rPr>
-                <w:rFonts w:ascii="Calibri" w:eastAsia="Calibri" w:hAnsi="Calibri" w:cs="Calibri"/>
-                <w:sz w:val="24"/>
-                <w:szCs w:val="24"/>
-              </w:rPr>
-              <w:t>]</w:t>
+              <w:t>[TITULO]</w:t>
             </w:r>
           </w:p>
         </w:tc>
@@ -2773,25 +2755,7 @@
                 <w:sz w:val="24"/>
                 <w:szCs w:val="24"/>
               </w:rPr>
-              <w:t>[</w:t>
-            </w:r>
-            <w:proofErr w:type="gramStart"/>
-            <w:r>
-              <w:rPr>
-                <w:rFonts w:ascii="Calibri" w:eastAsia="Calibri" w:hAnsi="Calibri" w:cs="Calibri"/>
-                <w:sz w:val="24"/>
-                <w:szCs w:val="24"/>
-              </w:rPr>
-              <w:t>TITULO</w:t>
-            </w:r>
-            <w:proofErr w:type="gramEnd"/>
-            <w:r>
-              <w:rPr>
-                <w:rFonts w:ascii="Calibri" w:eastAsia="Calibri" w:hAnsi="Calibri" w:cs="Calibri"/>
-                <w:sz w:val="24"/>
-                <w:szCs w:val="24"/>
-              </w:rPr>
-              <w:t>]</w:t>
+              <w:t>[TITULO]</w:t>
             </w:r>
           </w:p>
         </w:tc>
@@ -2827,25 +2791,7 @@
                 <w:sz w:val="24"/>
                 <w:szCs w:val="24"/>
               </w:rPr>
-              <w:t>[DATA_</w:t>
-            </w:r>
-            <w:proofErr w:type="gramStart"/>
-            <w:r>
-              <w:rPr>
-                <w:rFonts w:ascii="Calibri" w:eastAsia="Calibri" w:hAnsi="Calibri" w:cs="Calibri"/>
-                <w:sz w:val="24"/>
-                <w:szCs w:val="24"/>
-              </w:rPr>
-              <w:t>INICIO</w:t>
-            </w:r>
-            <w:proofErr w:type="gramEnd"/>
-            <w:r>
-              <w:rPr>
-                <w:rFonts w:ascii="Calibri" w:eastAsia="Calibri" w:hAnsi="Calibri" w:cs="Calibri"/>
-                <w:sz w:val="24"/>
-                <w:szCs w:val="24"/>
-              </w:rPr>
-              <w:t>]</w:t>
+              <w:t>[DATA_INICIO]</w:t>
             </w:r>
           </w:p>
         </w:tc>
@@ -2909,7 +2855,9 @@
         <w:spacing w:before="240" w:after="240" w:line="360" w:lineRule="auto"/>
         <w:jc w:val="both"/>
         <w:rPr>
-          <w:rFonts w:ascii="Calibri" w:hAnsi="Calibri" w:cs="Calibri"/>
+          <w:rFonts w:ascii="Calibri" w:eastAsia="Calibri" w:hAnsi="Calibri" w:cs="Calibri"/>
+          <w:sz w:val="24"/>
+          <w:szCs w:val="24"/>
         </w:rPr>
       </w:pPr>
       <w:r>
@@ -2976,7 +2924,9 @@
       </w:r>
       <w:r>
         <w:rPr>
-          <w:rFonts w:ascii="Calibri" w:hAnsi="Calibri" w:cs="Calibri"/>
+          <w:rFonts w:ascii="Calibri" w:eastAsia="Calibri" w:hAnsi="Calibri" w:cs="Calibri"/>
+          <w:sz w:val="24"/>
+          <w:szCs w:val="24"/>
         </w:rPr>
         <w:br w:type="page"/>
       </w:r>
@@ -2986,9 +2936,10 @@
         <w:spacing w:line="360" w:lineRule="auto"/>
         <w:jc w:val="both"/>
         <w:rPr>
-          <w:rFonts w:ascii="Calibri" w:hAnsi="Calibri" w:cs="Calibri"/>
-          <w:sz w:val="22"/>
-          <w:szCs w:val="22"/>
+          <w:rFonts w:ascii="Calibri" w:eastAsia="Calibri" w:hAnsi="Calibri" w:cs="Calibri"/>
+          <w:sz w:val="24"/>
+          <w:szCs w:val="24"/>
+          <w:u w:val="single"/>
         </w:rPr>
       </w:pPr>
     </w:p>
@@ -3228,16 +3179,7 @@
                 <w:sz w:val="24"/>
                 <w:szCs w:val="24"/>
               </w:rPr>
-              <w:t>[TOTAL_</w:t>
-            </w:r>
-            <w:proofErr w:type="gramStart"/>
-            <w:r>
-              <w:rPr>
-                <w:rFonts w:ascii="Calibri" w:eastAsia="Calibri" w:hAnsi="Calibri" w:cs="Calibri"/>
-                <w:sz w:val="24"/>
-                <w:szCs w:val="24"/>
-              </w:rPr>
-              <w:t>HORAS]</w:t>
+              <w:t>[TOTAL_HORAS]</w:t>
             </w:r>
             <w:r>
               <w:rPr>
@@ -3245,16 +3187,7 @@
                 <w:sz w:val="24"/>
                 <w:szCs w:val="24"/>
               </w:rPr>
-              <w:t>/</w:t>
-            </w:r>
-            <w:proofErr w:type="gramEnd"/>
-            <w:r>
-              <w:rPr>
-                <w:rFonts w:ascii="Calibri" w:eastAsia="Calibri" w:hAnsi="Calibri" w:cs="Calibri"/>
-                <w:sz w:val="24"/>
-                <w:szCs w:val="24"/>
-              </w:rPr>
-              <w:t xml:space="preserve"> 10) * (250 / 100)</w:t>
+              <w:t>/ 10) * (250 / 100)</w:t>
             </w:r>
           </w:p>
         </w:tc>

</xml_diff>